<commit_message>
Docente B2 nuevo (reemplazo Amina): contrato v3.1 (comision dual 5pct casa / 10pct canal propio autofinanciado con registro de origen, preaviso 30 dias con transicion, clausula anti-comercializacion de terceros a la base + pauta aprobada por gerencia) + HOJA_ARRANQUE_DOCENTE_B2 (checklist: contrato primero, EF SET propio, guias previas, ritual de clase, cierre con 4 fotos, jamases, canal comercial aparte)
Co-Authored-By: Claude Fable 5 <noreply@anthropic.com>
Claude-Session: https://claude.ai/code/session_018H7C5dx3NvDfXiv3CfhPMa
</commit_message>
<xml_diff>
--- a/contratos/BORRADOR_CONTRATO_DOCENTE_ALIANZAS_v3.docx
+++ b/contratos/BORRADOR_CONTRATO_DOCENTE_ALIANZAS_v3.docx
@@ -73,7 +73,7 @@
         <w:rPr>
           <w:sz w:val="21"/>
         </w:rPr>
-        <w:t>(a) DOCENCIA: el CONTRATISTA dictará los cursos que se le asignen mediante ACTA INTERNA DE PROGRAMACIÓN ACADÉMICA suscrita por las partes, en la cual se indicará para cada curso: nivel, número de horas, horario y fechas. El valor de la hora cátedra es de DIECISIETE MIL PESOS COP ($17.000) [verificar valor vigente], pagadero por mensualidades vencidas de acuerdo con las horas efectivamente impartidas. (b) GESTIÓN DE ALIANZAS: el CONTRATISTA gestionará la presentación de los programas de alianza ante empresas e instituciones educativas, usando exclusivamente los materiales y condiciones aprobados por gerencia. Remuneración de alianzas: [DEFINIR CON GERENCIA ANTES DE FIRMA: $________ por convenio activado y/o ____% del recaudo de la primera matrícula de cada beneficiario de empresa/colegio aliado, pagadero contra ingreso efectivo a caja].</w:t>
+        <w:t>(a) DOCENCIA: el CONTRATISTA dictará los cursos que se le asignen mediante ACTA INTERNA DE PROGRAMACIÓN ACADÉMICA suscrita por las partes, en la cual se indicará para cada curso: nivel, número de horas, horario y fechas. El valor de la hora cátedra es de DIECISIETE MIL PESOS COP ($17.000) [verificar valor vigente], pagadero por mensualidades vencidas de acuerdo con las horas efectivamente impartidas. (b) GESTIÓN DE ALIANZAS: el CONTRATISTA gestionará la presentación de los programas de alianza ante empresas e instituciones educativas, usando exclusivamente los materiales y condiciones aprobados por gerencia. Remuneración comercial por DOS canales, siempre sobre el recaudo efectivo a caja: (i) ventas de leads entregados por la institución: CINCO por ciento (5%) del recaudo de cliente nuevo y 2,5% de cliente antiguo; (ii) CANAL PROPIO AUTOFINANCIADO — leads generados y financiados íntegramente por EL CONTRATISTA (su pauta, su red, su gestión): DIEZ por ciento (10%) del recaudo de cliente nuevo. El origen de cada lead queda registrado en la planilla comercial al primer contacto; en caso de conflicto, el lead pertenece a quien lo registró primero. Sin recaudo no hay comisión.</w:t>
       </w:r>
     </w:p>
     <w:p>
@@ -85,7 +85,7 @@
           <w:b/>
           <w:sz w:val="21"/>
         </w:rPr>
-        <w:t>PARÁGRAFO I. El presente contrato se mantiene vigente por el término de UN (1) AÑO contado desde su suscripción, prorrogable por acuerdo escrito. La terminación o culminación de un curso individual NO termina el contrato: solo cierra el acta correspondiente.</w:t>
+        <w:t>PARÁGRAFO I. El presente contrato se mantiene vigente por el término de UN (1) AÑO contado desde su suscripción, prorrogable por acuerdo escrito. La terminación o culminación de un curso individual NO termina el contrato: solo cierra el acta correspondiente. Cualquiera de las partes podrá terminar el contrato con PREAVISO ESCRITO de TREINTA (30) días calendario; tratándose de cursos en ejecución, EL CONTRATISTA acompañará la transición del curso durante ese período conforme a las guías de la institución.</w:t>
       </w:r>
     </w:p>
     <w:p>
@@ -443,6 +443,19 @@
           <w:sz w:val="21"/>
         </w:rPr>
         <w:t>22. EN LA GESTIÓN DE ALIANZAS: usar únicamente los materiales, cartas y condiciones aprobados por gerencia; no prometer empleo, visas, prácticas, contratos de aprendizaje ni resultados; no negociar precios, becas ni condiciones por fuera de las escritas; registrar ante gerencia cada gestión realizada (empresa/colegio, contacto, estado, próximo paso); y tratar las listas de contactos y condiciones comerciales como Material Protegido.</w:t>
+      </w:r>
+    </w:p>
+    <w:p>
+      <w:pPr>
+        <w:spacing w:after="60"/>
+        <w:ind w:left="340"/>
+      </w:pPr>
+      <w:r>
+        <w:rPr>
+          <w:b w:val="0"/>
+          <w:sz w:val="21"/>
+        </w:rPr>
+        <w:t>23. NO COMERCIALIZAR programas, cursos o servicios propios o de terceros (incluidos programas de estudios en el exterior) a estudiantes, exalumnos, acudientes o bases de datos de la institución, salvo acuerdo escrito de remisión firmado por el representante legal. Toda pieza publicitaria del canal propio del CONTRATISTA que use la marca o los programas de la institución requiere aprobación escrita de gerencia ANTES de su publicación. El aula jamás se usa para actividad comercial.</w:t>
       </w:r>
     </w:p>
     <w:p>

</xml_diff>